<commit_message>
Rewrite resume generator: ATS-compliant, no hard page breaks, natural 2-page flow, 1-inch margins, Calibri, keep-with-next headings
</commit_message>
<xml_diff>
--- a/Harikrishnan_2026.docx
+++ b/Harikrishnan_2026.docx
@@ -4,6 +4,7 @@
   <w:body>
     <w:p>
       <w:pPr>
+        <w:spacing w:after="40"/>
         <w:jc w:val="center"/>
       </w:pPr>
       <w:r>
@@ -19,6 +20,7 @@
     </w:p>
     <w:p>
       <w:pPr>
+        <w:spacing w:after="40"/>
         <w:jc w:val="center"/>
       </w:pPr>
       <w:r>
@@ -27,13 +29,14 @@
           <w:b w:val="0"/>
           <w:i w:val="0"/>
           <w:color w:val="505050"/>
-          <w:sz w:val="20"/>
+          <w:sz w:val="24"/>
         </w:rPr>
         <w:t>Business Analyst | Trust &amp; Safety | Automation &amp; Data Systems</w:t>
       </w:r>
     </w:p>
     <w:p>
       <w:pPr>
+        <w:spacing w:after="120"/>
         <w:jc w:val="center"/>
       </w:pPr>
       <w:r>
@@ -42,12 +45,119 @@
           <w:b w:val="0"/>
           <w:i w:val="0"/>
           <w:color w:val="646464"/>
-          <w:sz w:val="17"/>
+          <w:sz w:val="18"/>
         </w:rPr>
-        <w:t>harikrishnanz98@gmail.com | +91 9744754654 | https://www.linkedin.com/in/harikriz | https://harikriz.netlify.app</w:t>
+        <w:t>harikrishnanz98@gmail.com  |  +91 9744754654  |  https://www.linkedin.com/in/harikriz  |  https://harikriz.netlify.app</w:t>
       </w:r>
     </w:p>
     <w:p>
+      <w:pPr>
+        <w:spacing w:before="200" w:after="0"/>
+        <w:keepNext/>
+      </w:pPr>
+      <w:r>
+        <w:rPr>
+          <w:rFonts w:ascii="Calibri" w:hAnsi="Calibri"/>
+          <w:b/>
+          <w:i w:val="0"/>
+          <w:color w:val="2B2B5E"/>
+          <w:sz w:val="24"/>
+        </w:rPr>
+        <w:t>PROFESSIONAL SUMMARY</w:t>
+      </w:r>
+    </w:p>
+    <w:p>
+      <w:pPr>
+        <w:spacing w:before="20" w:after="80"/>
+        <w:pBdr>
+          <w:bottom w:val="single" w:sz="4" w:space="1" w:color="2B2B5E"/>
+        </w:pBdr>
+        <w:keepNext/>
+      </w:pPr>
+    </w:p>
+    <w:p>
+      <w:pPr>
+        <w:spacing w:before="80" w:after="80" w:line="276" w:lineRule="exact"/>
+      </w:pPr>
+      <w:r>
+        <w:rPr>
+          <w:rFonts w:ascii="Calibri" w:hAnsi="Calibri"/>
+          <w:b w:val="0"/>
+          <w:i w:val="0"/>
+          <w:sz w:val="22"/>
+        </w:rPr>
+        <w:t>Results-driven Business Analyst with 5+ years of experience building risk detection frameworks, audit automation platforms, and enforcement quality systems at scale. Proven ability to thrive in ambiguous, compliance-intensive environments, delivering automated integrity solutions adopted by 250+ users globally and processing millions of records with measurable gains in accuracy, efficiency, and risk coverage.</w:t>
+      </w:r>
+    </w:p>
+    <w:p>
+      <w:pPr>
+        <w:spacing w:before="200" w:after="0"/>
+        <w:keepNext/>
+      </w:pPr>
+      <w:r>
+        <w:rPr>
+          <w:rFonts w:ascii="Calibri" w:hAnsi="Calibri"/>
+          <w:b/>
+          <w:i w:val="0"/>
+          <w:color w:val="2B2B5E"/>
+          <w:sz w:val="24"/>
+        </w:rPr>
+        <w:t>CORE COMPETENCIES</w:t>
+      </w:r>
+    </w:p>
+    <w:p>
+      <w:pPr>
+        <w:spacing w:before="20" w:after="80"/>
+        <w:pBdr>
+          <w:bottom w:val="single" w:sz="4" w:space="1" w:color="2B2B5E"/>
+        </w:pBdr>
+        <w:keepNext/>
+      </w:pPr>
+    </w:p>
+    <w:p>
+      <w:pPr>
+        <w:spacing w:before="80" w:after="80" w:line="276" w:lineRule="exact"/>
+      </w:pPr>
+      <w:r>
+        <w:rPr>
+          <w:rFonts w:ascii="Calibri" w:hAnsi="Calibri"/>
+          <w:b w:val="0"/>
+          <w:i w:val="0"/>
+          <w:sz w:val="22"/>
+        </w:rPr>
+        <w:t>Python, SQL, AWS (S3, Redshift, DynamoDB, CloudWatch), Flask, VBA, ETL Pipeline Development, Risk Detection &amp; Sampling Logic, Audit Automation, Data Analysis &amp; Visualization, QuickSight Dashboarding, SAP, Excel, Workflow Optimization, Stakeholder Management, Internal Tool Development, AHT Modeling &amp; Bottleneck Analysis</w:t>
+      </w:r>
+    </w:p>
+    <w:p>
+      <w:pPr>
+        <w:spacing w:before="200" w:after="0"/>
+        <w:keepNext/>
+      </w:pPr>
+      <w:r>
+        <w:rPr>
+          <w:rFonts w:ascii="Calibri" w:hAnsi="Calibri"/>
+          <w:b/>
+          <w:i w:val="0"/>
+          <w:color w:val="2B2B5E"/>
+          <w:sz w:val="24"/>
+        </w:rPr>
+        <w:t>PROFESSIONAL EXPERIENCE</w:t>
+      </w:r>
+    </w:p>
+    <w:p>
+      <w:pPr>
+        <w:spacing w:before="20" w:after="80"/>
+        <w:pBdr>
+          <w:bottom w:val="single" w:sz="4" w:space="1" w:color="2B2B5E"/>
+        </w:pBdr>
+        <w:keepNext/>
+      </w:pPr>
+    </w:p>
+    <w:p>
+      <w:pPr>
+        <w:spacing w:before="160" w:after="0"/>
+        <w:keepNext/>
+      </w:pPr>
       <w:r>
         <w:rPr>
           <w:rFonts w:ascii="Calibri" w:hAnsi="Calibri"/>
@@ -55,94 +165,6 @@
           <w:i w:val="0"/>
           <w:color w:val="2B2B5E"/>
           <w:sz w:val="22"/>
-        </w:rPr>
-        <w:t>PROFESSIONAL SUMMARY</w:t>
-      </w:r>
-    </w:p>
-    <w:p>
-      <w:pPr>
-        <w:spacing w:before="0" w:after="60"/>
-        <w:pBdr>
-          <w:bottom w:val="single" w:sz="4" w:space="1" w:color="2B2B5E"/>
-        </w:pBdr>
-      </w:pPr>
-    </w:p>
-    <w:p>
-      <w:pPr>
-        <w:spacing w:before="60"/>
-      </w:pPr>
-      <w:r>
-        <w:rPr>
-          <w:rFonts w:ascii="Calibri" w:hAnsi="Calibri"/>
-          <w:b w:val="0"/>
-          <w:i w:val="0"/>
-          <w:sz w:val="19"/>
-        </w:rPr>
-        <w:t>Results-driven Business Analyst with 5+ years of experience building risk detection frameworks, audit automation platforms, and enforcement quality systems at scale. Proven ability to thrive in ambiguous, compliance-intensive environments, delivering automated integrity solutions adopted by 250+ users globally and processing millions of records with measurable gains in accuracy, efficiency, and risk coverage.</w:t>
-      </w:r>
-    </w:p>
-    <w:p>
-      <w:r>
-        <w:rPr>
-          <w:rFonts w:ascii="Calibri" w:hAnsi="Calibri"/>
-          <w:b/>
-          <w:i w:val="0"/>
-          <w:color w:val="2B2B5E"/>
-          <w:sz w:val="22"/>
-        </w:rPr>
-        <w:t>CORE COMPETENCIES</w:t>
-      </w:r>
-    </w:p>
-    <w:p>
-      <w:pPr>
-        <w:spacing w:before="0" w:after="60"/>
-        <w:pBdr>
-          <w:bottom w:val="single" w:sz="4" w:space="1" w:color="2B2B5E"/>
-        </w:pBdr>
-      </w:pPr>
-    </w:p>
-    <w:p>
-      <w:pPr>
-        <w:spacing w:before="60"/>
-      </w:pPr>
-      <w:r>
-        <w:rPr>
-          <w:rFonts w:ascii="Calibri" w:hAnsi="Calibri"/>
-          <w:b w:val="0"/>
-          <w:i w:val="0"/>
-          <w:sz w:val="19"/>
-        </w:rPr>
-        <w:t>Python | SQL | AWS (S3, Redshift, DynamoDB, CloudWatch) | Flask | VBA | ETL Pipeline Development | Risk Detection &amp; Sampling Logic | Audit Automation | Data Analysis &amp; Visualization | QuickSight Dashboarding | SAP | Excel | Workflow Optimization | Stakeholder Management | Internal Tool Development | AHT Modeling &amp; Bottleneck Analysis</w:t>
-      </w:r>
-    </w:p>
-    <w:p>
-      <w:r>
-        <w:rPr>
-          <w:rFonts w:ascii="Calibri" w:hAnsi="Calibri"/>
-          <w:b/>
-          <w:i w:val="0"/>
-          <w:color w:val="2B2B5E"/>
-          <w:sz w:val="22"/>
-        </w:rPr>
-        <w:t>PROFESSIONAL EXPERIENCE</w:t>
-      </w:r>
-    </w:p>
-    <w:p>
-      <w:pPr>
-        <w:spacing w:before="0" w:after="60"/>
-        <w:pBdr>
-          <w:bottom w:val="single" w:sz="4" w:space="1" w:color="2B2B5E"/>
-        </w:pBdr>
-      </w:pPr>
-    </w:p>
-    <w:p>
-      <w:r>
-        <w:rPr>
-          <w:rFonts w:ascii="Calibri" w:hAnsi="Calibri"/>
-          <w:b/>
-          <w:i w:val="0"/>
-          <w:color w:val="2B2B5E"/>
-          <w:sz w:val="21"/>
         </w:rPr>
         <w:t>Business Analyst</w:t>
       </w:r>
@@ -152,7 +174,7 @@
           <w:b w:val="0"/>
           <w:i w:val="0"/>
           <w:color w:val="787878"/>
-          <w:sz w:val="20"/>
+          <w:sz w:val="22"/>
         </w:rPr>
         <w:t xml:space="preserve">  |  </w:t>
       </w:r>
@@ -161,171 +183,189 @@
           <w:rFonts w:ascii="Calibri" w:hAnsi="Calibri"/>
           <w:b/>
           <w:i w:val="0"/>
-          <w:sz w:val="20"/>
+          <w:sz w:val="22"/>
         </w:rPr>
         <w:t>Amazon Prime Video and Studios</w:t>
       </w:r>
     </w:p>
     <w:p>
+      <w:pPr>
+        <w:spacing w:before="20" w:after="60"/>
+        <w:keepNext/>
+      </w:pPr>
       <w:r>
         <w:rPr>
           <w:rFonts w:ascii="Calibri" w:hAnsi="Calibri"/>
           <w:b w:val="0"/>
           <w:i/>
           <w:color w:val="646464"/>
-          <w:sz w:val="18"/>
+          <w:sz w:val="20"/>
         </w:rPr>
-        <w:t>May 2022 – Present  |  Bangalore</w:t>
+        <w:t>May 2022 Present  |  Bangalore</w:t>
       </w:r>
     </w:p>
     <w:p>
       <w:pPr>
-        <w:ind w:left="360" w:hanging="288"/>
+        <w:spacing w:before="40" w:after="40" w:line="276" w:lineRule="exact"/>
+        <w:ind w:left="432" w:hanging="288"/>
       </w:pPr>
       <w:r>
         <w:rPr>
           <w:rFonts w:ascii="Calibri" w:hAnsi="Calibri"/>
           <w:b w:val="0"/>
           <w:i w:val="0"/>
-          <w:sz w:val="19"/>
+          <w:sz w:val="22"/>
         </w:rPr>
-        <w:t>•  Architected and deployed full-stack audit orchestration platform using Python, Flask, DynamoDB, and Redshift, now used by 200+ employees globally, saving 18 analyst-hours per day and reducing manual touchpoints from 30+ to 3.</w:t>
+        <w:t>- Architected and deployed full-stack audit orchestration platform using Python, Flask, DynamoDB, and Redshift, now used by 200+ employees globally, saving 18 analyst-hours per day and reducing manual touchpoints from 30+ to 3.</w:t>
       </w:r>
     </w:p>
     <w:p>
       <w:pPr>
-        <w:ind w:left="360" w:hanging="288"/>
+        <w:spacing w:before="40" w:after="40" w:line="276" w:lineRule="exact"/>
+        <w:ind w:left="432" w:hanging="288"/>
       </w:pPr>
       <w:r>
         <w:rPr>
           <w:rFonts w:ascii="Calibri" w:hAnsi="Calibri"/>
           <w:b w:val="0"/>
           <w:i w:val="0"/>
-          <w:sz w:val="19"/>
+          <w:sz w:val="22"/>
         </w:rPr>
-        <w:t>•  Engineered Python-based agent automation system for storefront compliance audits, integrating playback simulation, screenshot capture, and Cloud OCR processing with automated pass/fail detection logic.</w:t>
+        <w:t>- Engineered Python-based agent automation system for storefront compliance audits, integrating playback simulation, screenshot capture, and Cloud OCR processing with automated pass/fail detection logic.</w:t>
       </w:r>
     </w:p>
     <w:p>
       <w:pPr>
-        <w:ind w:left="360" w:hanging="288"/>
+        <w:spacing w:before="40" w:after="40" w:line="276" w:lineRule="exact"/>
+        <w:ind w:left="432" w:hanging="288"/>
       </w:pPr>
       <w:r>
         <w:rPr>
           <w:rFonts w:ascii="Calibri" w:hAnsi="Calibri"/>
           <w:b w:val="0"/>
           <w:i w:val="0"/>
-          <w:sz w:val="19"/>
+          <w:sz w:val="22"/>
         </w:rPr>
-        <w:t>•  Redesigned SQL-based defect detection thresholds through historical pattern analysis, achieving 30% improvement in critical issue detection while reducing false positives in enforcement pipelines.</w:t>
+        <w:t>- Redesigned SQL-based defect detection thresholds through historical pattern analysis, achieving 30% improvement in critical issue detection while reducing false positives in enforcement pipelines.</w:t>
       </w:r>
     </w:p>
     <w:p>
       <w:pPr>
-        <w:ind w:left="360" w:hanging="288"/>
+        <w:spacing w:before="40" w:after="40" w:line="276" w:lineRule="exact"/>
+        <w:ind w:left="432" w:hanging="288"/>
       </w:pPr>
       <w:r>
         <w:rPr>
           <w:rFonts w:ascii="Calibri" w:hAnsi="Calibri"/>
           <w:b w:val="0"/>
           <w:i w:val="0"/>
-          <w:sz w:val="19"/>
+          <w:sz w:val="22"/>
         </w:rPr>
-        <w:t>•  Conducted deep-dive analysis on defect data across workflows, identifying recurring risk patterns and developing targeted risk-based sampling logic to surface erroneous items from large data pools.</w:t>
+        <w:t>- Conducted deep-dive analysis on defect data across workflows, identifying recurring risk patterns and developing targeted risk-based sampling logic to surface erroneous items from large data pools.</w:t>
       </w:r>
     </w:p>
     <w:p>
       <w:pPr>
-        <w:ind w:left="360" w:hanging="288"/>
+        <w:spacing w:before="40" w:after="40" w:line="276" w:lineRule="exact"/>
+        <w:ind w:left="432" w:hanging="288"/>
       </w:pPr>
       <w:r>
         <w:rPr>
           <w:rFonts w:ascii="Calibri" w:hAnsi="Calibri"/>
           <w:b w:val="0"/>
           <w:i w:val="0"/>
-          <w:sz w:val="19"/>
+          <w:sz w:val="22"/>
         </w:rPr>
-        <w:t>•  Built ETL pipelines to ingest and process audited data daily, creating a self-adjusting risk detection system with continuous feedback loop between audit outcomes and detection thresholds.</w:t>
+        <w:t>- Built ETL pipelines to ingest and process audited data daily, creating a self-adjusting risk detection system with continuous feedback loop between audit outcomes and detection thresholds.</w:t>
       </w:r>
     </w:p>
     <w:p>
       <w:pPr>
-        <w:ind w:left="360" w:hanging="288"/>
+        <w:spacing w:before="40" w:after="40" w:line="276" w:lineRule="exact"/>
+        <w:ind w:left="432" w:hanging="288"/>
       </w:pPr>
       <w:r>
         <w:rPr>
           <w:rFonts w:ascii="Calibri" w:hAnsi="Calibri"/>
           <w:b w:val="0"/>
           <w:i w:val="0"/>
-          <w:sz w:val="19"/>
+          <w:sz w:val="22"/>
         </w:rPr>
-        <w:t>•  Designed and maintained standardized pipeline for model outputs per organizational requirements, owning critical datasets consumed by multiple analytical teams.</w:t>
+        <w:t>- Designed and maintained standardized pipeline for model outputs per organizational requirements, owning critical datasets consumed by multiple analytical teams.</w:t>
       </w:r>
     </w:p>
     <w:p>
       <w:pPr>
-        <w:ind w:left="360" w:hanging="288"/>
+        <w:spacing w:before="40" w:after="40" w:line="276" w:lineRule="exact"/>
+        <w:ind w:left="432" w:hanging="288"/>
       </w:pPr>
       <w:r>
         <w:rPr>
           <w:rFonts w:ascii="Calibri" w:hAnsi="Calibri"/>
           <w:b w:val="0"/>
           <w:i w:val="0"/>
-          <w:sz w:val="19"/>
+          <w:sz w:val="22"/>
         </w:rPr>
-        <w:t>•  Resolved 100+ ad-hoc data requests from cross-functional stakeholders, delivering custom SQL queries, data extracts, and analytical summaries under tight deadlines.</w:t>
+        <w:t>- Resolved 100+ ad-hoc data requests from cross-functional stakeholders, delivering custom SQL queries, data extracts, and analytical summaries under tight deadlines.</w:t>
       </w:r>
     </w:p>
     <w:p>
       <w:pPr>
-        <w:ind w:left="360" w:hanging="288"/>
+        <w:spacing w:before="40" w:after="40" w:line="276" w:lineRule="exact"/>
+        <w:ind w:left="432" w:hanging="288"/>
       </w:pPr>
       <w:r>
         <w:rPr>
           <w:rFonts w:ascii="Calibri" w:hAnsi="Calibri"/>
           <w:b w:val="0"/>
           <w:i w:val="0"/>
-          <w:sz w:val="19"/>
+          <w:sz w:val="22"/>
         </w:rPr>
-        <w:t>•  Developed dynamic Time and Motion Study engine with step-wise time capture, automatic AHT calculation, bottleneck discovery, and optimal vs achievable target modeling.</w:t>
+        <w:t>- Developed dynamic Time and Motion Study engine with step-wise time capture, automatic AHT calculation, bottleneck discovery, and optimal vs achievable target modeling.</w:t>
       </w:r>
     </w:p>
     <w:p>
       <w:pPr>
-        <w:ind w:left="360" w:hanging="288"/>
+        <w:spacing w:before="40" w:after="40" w:line="276" w:lineRule="exact"/>
+        <w:ind w:left="432" w:hanging="288"/>
       </w:pPr>
       <w:r>
         <w:rPr>
           <w:rFonts w:ascii="Calibri" w:hAnsi="Calibri"/>
           <w:b w:val="0"/>
           <w:i w:val="0"/>
-          <w:sz w:val="19"/>
+          <w:sz w:val="22"/>
         </w:rPr>
-        <w:t>•  Developed 3 VBA macros deployed as BAU tools across 50+ employees, saving approximately 10 hours per week and achieving 80% manual touchpoint reduction in audit workflows.</w:t>
+        <w:t>- Developed 3 VBA macros deployed as BAU tools across 50+ employees, saving approximately 10 hours per week and achieving 80% manual touchpoint reduction in audit workflows.</w:t>
       </w:r>
     </w:p>
     <w:p>
       <w:pPr>
-        <w:ind w:left="360" w:hanging="288"/>
+        <w:spacing w:before="40" w:after="40" w:line="276" w:lineRule="exact"/>
+        <w:ind w:left="432" w:hanging="288"/>
       </w:pPr>
       <w:r>
         <w:rPr>
           <w:rFonts w:ascii="Calibri" w:hAnsi="Calibri"/>
           <w:b w:val="0"/>
           <w:i w:val="0"/>
-          <w:sz w:val="19"/>
+          <w:sz w:val="22"/>
         </w:rPr>
-        <w:t>•  Built live admin dashboards using QuickSight, enabling self-serve workflow visibility and tracking volumes, quality, and SLA trends for leadership reviews.</w:t>
+        <w:t>- Built live admin dashboards using QuickSight, enabling self-serve workflow visibility and tracking volumes, quality, and SLA trends for leadership reviews.</w:t>
       </w:r>
     </w:p>
     <w:p>
+      <w:pPr>
+        <w:spacing w:before="160" w:after="0"/>
+        <w:keepNext/>
+      </w:pPr>
       <w:r>
         <w:rPr>
           <w:rFonts w:ascii="Calibri" w:hAnsi="Calibri"/>
           <w:b/>
           <w:i w:val="0"/>
           <w:color w:val="2B2B5E"/>
-          <w:sz w:val="21"/>
+          <w:sz w:val="22"/>
         </w:rPr>
         <w:t>Catalog Specialist</w:t>
       </w:r>
@@ -335,7 +375,7 @@
           <w:b w:val="0"/>
           <w:i w:val="0"/>
           <w:color w:val="787878"/>
-          <w:sz w:val="20"/>
+          <w:sz w:val="22"/>
         </w:rPr>
         <w:t xml:space="preserve">  |  </w:t>
       </w:r>
@@ -344,73 +384,84 @@
           <w:rFonts w:ascii="Calibri" w:hAnsi="Calibri"/>
           <w:b/>
           <w:i w:val="0"/>
-          <w:sz w:val="20"/>
+          <w:sz w:val="22"/>
         </w:rPr>
         <w:t>Amazon Prime Video and Studios</w:t>
       </w:r>
     </w:p>
     <w:p>
+      <w:pPr>
+        <w:spacing w:before="20" w:after="60"/>
+        <w:keepNext/>
+      </w:pPr>
       <w:r>
         <w:rPr>
           <w:rFonts w:ascii="Calibri" w:hAnsi="Calibri"/>
           <w:b w:val="0"/>
           <w:i/>
           <w:color w:val="646464"/>
-          <w:sz w:val="18"/>
+          <w:sz w:val="20"/>
         </w:rPr>
-        <w:t>March 2022 – May 2022  |  Bangalore</w:t>
+        <w:t>March 2022 May 2022  |  Bangalore</w:t>
       </w:r>
     </w:p>
     <w:p>
       <w:pPr>
-        <w:ind w:left="360" w:hanging="288"/>
+        <w:spacing w:before="40" w:after="40" w:line="276" w:lineRule="exact"/>
+        <w:ind w:left="432" w:hanging="288"/>
       </w:pPr>
       <w:r>
         <w:rPr>
           <w:rFonts w:ascii="Calibri" w:hAnsi="Calibri"/>
           <w:b w:val="0"/>
           <w:i w:val="0"/>
-          <w:sz w:val="19"/>
+          <w:sz w:val="22"/>
         </w:rPr>
-        <w:t>•  Conducted content analysis and classification with 98% productivity while maintaining 100% quality standards.</w:t>
+        <w:t>- Conducted content analysis and classification with 98% productivity while maintaining 100% quality standards.</w:t>
       </w:r>
     </w:p>
     <w:p>
       <w:pPr>
-        <w:ind w:left="360" w:hanging="288"/>
+        <w:spacing w:before="40" w:after="40" w:line="276" w:lineRule="exact"/>
+        <w:ind w:left="432" w:hanging="288"/>
       </w:pPr>
       <w:r>
         <w:rPr>
           <w:rFonts w:ascii="Calibri" w:hAnsi="Calibri"/>
           <w:b w:val="0"/>
           <w:i w:val="0"/>
-          <w:sz w:val="19"/>
+          <w:sz w:val="22"/>
         </w:rPr>
-        <w:t>•  Managed sensitive corporate data in secure environment with strict governance protocols.</w:t>
+        <w:t>- Managed sensitive corporate data in secure environment with strict governance protocols.</w:t>
       </w:r>
     </w:p>
     <w:p>
       <w:pPr>
-        <w:ind w:left="360" w:hanging="288"/>
+        <w:spacing w:before="40" w:after="40" w:line="276" w:lineRule="exact"/>
+        <w:ind w:left="432" w:hanging="288"/>
       </w:pPr>
       <w:r>
         <w:rPr>
           <w:rFonts w:ascii="Calibri" w:hAnsi="Calibri"/>
           <w:b w:val="0"/>
           <w:i w:val="0"/>
-          <w:sz w:val="19"/>
+          <w:sz w:val="22"/>
         </w:rPr>
-        <w:t>•  Collaborated with 40+ team members on data collection, validation, and weekly reporting.</w:t>
+        <w:t>- Collaborated with 40+ team members on data collection, validation, and weekly reporting.</w:t>
       </w:r>
     </w:p>
     <w:p>
+      <w:pPr>
+        <w:spacing w:before="160" w:after="0"/>
+        <w:keepNext/>
+      </w:pPr>
       <w:r>
         <w:rPr>
           <w:rFonts w:ascii="Calibri" w:hAnsi="Calibri"/>
           <w:b/>
           <w:i w:val="0"/>
           <w:color w:val="2B2B5E"/>
-          <w:sz w:val="21"/>
+          <w:sz w:val="22"/>
         </w:rPr>
         <w:t>Operational Assistant</w:t>
       </w:r>
@@ -420,7 +471,7 @@
           <w:b w:val="0"/>
           <w:i w:val="0"/>
           <w:color w:val="787878"/>
-          <w:sz w:val="20"/>
+          <w:sz w:val="22"/>
         </w:rPr>
         <w:t xml:space="preserve">  |  </w:t>
       </w:r>
@@ -429,92 +480,108 @@
           <w:rFonts w:ascii="Calibri" w:hAnsi="Calibri"/>
           <w:b/>
           <w:i w:val="0"/>
-          <w:sz w:val="20"/>
+          <w:sz w:val="22"/>
         </w:rPr>
         <w:t>MRF Limited</w:t>
       </w:r>
     </w:p>
     <w:p>
+      <w:pPr>
+        <w:spacing w:before="20" w:after="60"/>
+        <w:keepNext/>
+      </w:pPr>
       <w:r>
         <w:rPr>
           <w:rFonts w:ascii="Calibri" w:hAnsi="Calibri"/>
           <w:b w:val="0"/>
           <w:i/>
           <w:color w:val="646464"/>
-          <w:sz w:val="18"/>
+          <w:sz w:val="20"/>
         </w:rPr>
-        <w:t>January 2021 – March 2022  |  Agra</w:t>
+        <w:t>January 2021 March 2022  |  Agra</w:t>
       </w:r>
     </w:p>
     <w:p>
       <w:pPr>
-        <w:ind w:left="360" w:hanging="288"/>
+        <w:spacing w:before="40" w:after="40" w:line="276" w:lineRule="exact"/>
+        <w:ind w:left="432" w:hanging="288"/>
       </w:pPr>
       <w:r>
         <w:rPr>
           <w:rFonts w:ascii="Calibri" w:hAnsi="Calibri"/>
           <w:b w:val="0"/>
           <w:i w:val="0"/>
-          <w:sz w:val="19"/>
+          <w:sz w:val="22"/>
         </w:rPr>
-        <w:t>•  Generated daily Management Information Reports by compiling and analyzing large datasets for senior management decision-making.</w:t>
+        <w:t>- Generated daily Management Information Reports by compiling and analyzing large datasets for senior management decision-making.</w:t>
       </w:r>
     </w:p>
     <w:p>
       <w:pPr>
-        <w:ind w:left="360" w:hanging="288"/>
+        <w:spacing w:before="40" w:after="40" w:line="276" w:lineRule="exact"/>
+        <w:ind w:left="432" w:hanging="288"/>
       </w:pPr>
       <w:r>
         <w:rPr>
           <w:rFonts w:ascii="Calibri" w:hAnsi="Calibri"/>
           <w:b w:val="0"/>
           <w:i w:val="0"/>
-          <w:sz w:val="19"/>
+          <w:sz w:val="22"/>
         </w:rPr>
-        <w:t>•  Managed SAP-based operations including vendor liabilities, inventory tracking, sales analysis, and inter-office stock transfers.</w:t>
+        <w:t>- Managed SAP-based operations including vendor liabilities, inventory tracking, sales analysis, and inter-office stock transfers.</w:t>
       </w:r>
     </w:p>
     <w:p>
       <w:pPr>
-        <w:ind w:left="360" w:hanging="288"/>
+        <w:spacing w:before="40" w:after="40" w:line="276" w:lineRule="exact"/>
+        <w:ind w:left="432" w:hanging="288"/>
       </w:pPr>
       <w:r>
         <w:rPr>
           <w:rFonts w:ascii="Calibri" w:hAnsi="Calibri"/>
           <w:b w:val="0"/>
           <w:i w:val="0"/>
-          <w:sz w:val="19"/>
+          <w:sz w:val="22"/>
         </w:rPr>
-        <w:t>•  Prepared and led TDS and TCS Returns, ensuring compliance with regulatory requirements.</w:t>
+        <w:t>- Prepared and led TDS and TCS Returns, ensuring compliance with regulatory requirements.</w:t>
       </w:r>
     </w:p>
     <w:p>
+      <w:pPr>
+        <w:spacing w:before="200" w:after="0"/>
+        <w:keepNext/>
+      </w:pPr>
       <w:r>
         <w:rPr>
           <w:rFonts w:ascii="Calibri" w:hAnsi="Calibri"/>
           <w:b/>
           <w:i w:val="0"/>
           <w:color w:val="2B2B5E"/>
-          <w:sz w:val="22"/>
+          <w:sz w:val="24"/>
         </w:rPr>
         <w:t>EDUCATION</w:t>
       </w:r>
     </w:p>
     <w:p>
       <w:pPr>
-        <w:spacing w:before="0" w:after="60"/>
+        <w:spacing w:before="20" w:after="80"/>
         <w:pBdr>
           <w:bottom w:val="single" w:sz="4" w:space="1" w:color="2B2B5E"/>
         </w:pBdr>
+        <w:keepNext/>
       </w:pPr>
     </w:p>
     <w:p>
+      <w:pPr>
+        <w:spacing w:before="120" w:after="40" w:line="276" w:lineRule="exact"/>
+        <w:keepLines/>
+      </w:pPr>
       <w:r>
         <w:rPr>
           <w:rFonts w:ascii="Calibri" w:hAnsi="Calibri"/>
           <w:b/>
           <w:i w:val="0"/>
-          <w:sz w:val="20"/>
+          <w:sz w:val="22"/>
         </w:rPr>
         <w:t>Bachelor of Commerce</w:t>
       </w:r>
@@ -524,7 +591,7 @@
           <w:b w:val="0"/>
           <w:i w:val="0"/>
           <w:color w:val="787878"/>
-          <w:sz w:val="19"/>
+          <w:sz w:val="22"/>
         </w:rPr>
         <w:t xml:space="preserve">  |  </w:t>
       </w:r>
@@ -533,7 +600,7 @@
           <w:rFonts w:ascii="Calibri" w:hAnsi="Calibri"/>
           <w:b w:val="0"/>
           <w:i w:val="0"/>
-          <w:sz w:val="19"/>
+          <w:sz w:val="22"/>
         </w:rPr>
         <w:t>Kerala University, S.D College</w:t>
       </w:r>
@@ -543,7 +610,7 @@
           <w:b w:val="0"/>
           <w:i w:val="0"/>
           <w:color w:val="787878"/>
-          <w:sz w:val="19"/>
+          <w:sz w:val="22"/>
         </w:rPr>
         <w:t xml:space="preserve">  |  </w:t>
       </w:r>
@@ -553,9 +620,9 @@
           <w:b w:val="0"/>
           <w:i/>
           <w:color w:val="646464"/>
-          <w:sz w:val="19"/>
+          <w:sz w:val="22"/>
         </w:rPr>
-        <w:t>2016 – 2019</w:t>
+        <w:t>2016 2019</w:t>
       </w:r>
       <w:r>
         <w:rPr>
@@ -563,7 +630,7 @@
           <w:b w:val="0"/>
           <w:i w:val="0"/>
           <w:color w:val="787878"/>
-          <w:sz w:val="19"/>
+          <w:sz w:val="22"/>
         </w:rPr>
         <w:t xml:space="preserve">  |  </w:t>
       </w:r>
@@ -573,18 +640,22 @@
           <w:b w:val="0"/>
           <w:i w:val="0"/>
           <w:color w:val="505050"/>
-          <w:sz w:val="19"/>
+          <w:sz w:val="22"/>
         </w:rPr>
         <w:t>CGPA: 7.1/10</w:t>
       </w:r>
     </w:p>
     <w:p>
+      <w:pPr>
+        <w:spacing w:before="120" w:after="40" w:line="276" w:lineRule="exact"/>
+        <w:keepLines/>
+      </w:pPr>
       <w:r>
         <w:rPr>
           <w:rFonts w:ascii="Calibri" w:hAnsi="Calibri"/>
           <w:b/>
           <w:i w:val="0"/>
-          <w:sz w:val="20"/>
+          <w:sz w:val="22"/>
         </w:rPr>
         <w:t>Tally and MS Office Certification</w:t>
       </w:r>
@@ -594,7 +665,7 @@
           <w:b w:val="0"/>
           <w:i w:val="0"/>
           <w:color w:val="787878"/>
-          <w:sz w:val="19"/>
+          <w:sz w:val="22"/>
         </w:rPr>
         <w:t xml:space="preserve">  |  </w:t>
       </w:r>
@@ -603,7 +674,7 @@
           <w:rFonts w:ascii="Calibri" w:hAnsi="Calibri"/>
           <w:b w:val="0"/>
           <w:i w:val="0"/>
-          <w:sz w:val="19"/>
+          <w:sz w:val="22"/>
         </w:rPr>
         <w:t>ICMAI Chapters Institution</w:t>
       </w:r>
@@ -613,7 +684,7 @@
           <w:b w:val="0"/>
           <w:i w:val="0"/>
           <w:color w:val="787878"/>
-          <w:sz w:val="19"/>
+          <w:sz w:val="22"/>
         </w:rPr>
         <w:t xml:space="preserve">  |  </w:t>
       </w:r>
@@ -623,9 +694,9 @@
           <w:b w:val="0"/>
           <w:i/>
           <w:color w:val="646464"/>
-          <w:sz w:val="19"/>
+          <w:sz w:val="22"/>
         </w:rPr>
-        <w:t>2019 – 2020</w:t>
+        <w:t>2019 2020</w:t>
       </w:r>
       <w:r>
         <w:rPr>
@@ -633,7 +704,7 @@
           <w:b w:val="0"/>
           <w:i w:val="0"/>
           <w:color w:val="787878"/>
-          <w:sz w:val="19"/>
+          <w:sz w:val="22"/>
         </w:rPr>
         <w:t xml:space="preserve">  |  </w:t>
       </w:r>
@@ -643,14 +714,14 @@
           <w:b w:val="0"/>
           <w:i w:val="0"/>
           <w:color w:val="505050"/>
-          <w:sz w:val="19"/>
+          <w:sz w:val="22"/>
         </w:rPr>
         <w:t>Grade: A</w:t>
       </w:r>
     </w:p>
     <w:sectPr>
-      <w:pgSz w:w="12240" w:h="15840"/>
-      <w:pgMar w:top="576" w:right="792" w:bottom="576" w:left="792" w:header="720" w:footer="720" w:gutter="0"/>
+      <w:pgSz w:w="11909" w:h="16834"/>
+      <w:pgMar w:top="1440" w:right="1440" w:bottom="1440" w:left="1440" w:header="720" w:footer="720" w:gutter="0"/>
       <w:cols w:space="720"/>
       <w:docGrid w:linePitch="360"/>
     </w:sectPr>
@@ -1022,11 +1093,11 @@
     <w:qFormat/>
     <w:rsid w:val="00FC693F"/>
     <w:pPr>
-      <w:spacing w:after="0" w:before="0"/>
+      <w:spacing w:after="0" w:before="0" w:line="276" w:lineRule="exact"/>
     </w:pPr>
     <w:rPr>
       <w:rFonts w:ascii="Calibri" w:hAnsi="Calibri"/>
-      <w:sz w:val="20"/>
+      <w:sz w:val="22"/>
     </w:rPr>
   </w:style>
   <w:style w:type="paragraph" w:styleId="Header">

</xml_diff>

<commit_message>
Resume popup modal: professional CV viewer with download option, updated CV content from cv.txt
</commit_message>
<xml_diff>
--- a/Harikrishnan_2026.docx
+++ b/Harikrishnan_2026.docx
@@ -20,22 +20,6 @@
     </w:p>
     <w:p>
       <w:pPr>
-        <w:spacing w:after="40"/>
-        <w:jc w:val="center"/>
-      </w:pPr>
-      <w:r>
-        <w:rPr>
-          <w:rFonts w:ascii="Calibri" w:hAnsi="Calibri"/>
-          <w:b w:val="0"/>
-          <w:i w:val="0"/>
-          <w:color w:val="505050"/>
-          <w:sz w:val="24"/>
-        </w:rPr>
-        <w:t>Business Analyst | Trust &amp; Safety | Automation &amp; Data Systems</w:t>
-      </w:r>
-    </w:p>
-    <w:p>
-      <w:pPr>
         <w:spacing w:after="120"/>
         <w:jc w:val="center"/>
       </w:pPr>
@@ -47,7 +31,7 @@
           <w:color w:val="646464"/>
           <w:sz w:val="18"/>
         </w:rPr>
-        <w:t>harikrishnanz98@gmail.com  |  +91 9744754654  |  https://www.linkedin.com/in/harikriz  |  https://harikriz.netlify.app</w:t>
+        <w:t>+91 9744754654  |  harikrishnanz98@gmail.com  |  https://www.linkedin.com/in/harikriz</w:t>
       </w:r>
     </w:p>
     <w:p>
@@ -77,7 +61,7 @@
     </w:p>
     <w:p>
       <w:pPr>
-        <w:spacing w:before="80" w:after="80" w:line="276" w:lineRule="exact"/>
+        <w:spacing w:before="60" w:after="80" w:line="276" w:lineRule="exact"/>
       </w:pPr>
       <w:r>
         <w:rPr>
@@ -86,7 +70,7 @@
           <w:i w:val="0"/>
           <w:sz w:val="22"/>
         </w:rPr>
-        <w:t>Results-driven Business Analyst with 5+ years of experience building risk detection frameworks, audit automation platforms, and enforcement quality systems at scale. Proven ability to thrive in ambiguous, compliance-intensive environments, delivering automated integrity solutions adopted by 250+ users globally and processing millions of records with measurable gains in accuracy, efficiency, and risk coverage.</w:t>
+        <w:t>Analyst having 4+ years of experience driving risk detections, enforcement quality, and decision-making at scale in high volume content ecosystems. Proven ability to work under ambiguity, design automated integrity systems, and translate complex datasets into actionable insights. Strong background in SQL-based analytics, Python automation, and audit intelligence supporting millions of records and hundreds of users.</w:t>
       </w:r>
     </w:p>
     <w:p>
@@ -102,7 +86,7 @@
           <w:color w:val="2B2B5E"/>
           <w:sz w:val="24"/>
         </w:rPr>
-        <w:t>CORE COMPETENCIES</w:t>
+        <w:t>SKILLS</w:t>
       </w:r>
     </w:p>
     <w:p>
@@ -116,16 +100,257 @@
     </w:p>
     <w:p>
       <w:pPr>
-        <w:spacing w:before="80" w:after="80" w:line="276" w:lineRule="exact"/>
+        <w:spacing w:before="30" w:after="30" w:line="276" w:lineRule="exact"/>
+        <w:ind w:left="432" w:hanging="288"/>
       </w:pPr>
       <w:r>
         <w:rPr>
           <w:rFonts w:ascii="Calibri" w:hAnsi="Calibri"/>
           <w:b w:val="0"/>
           <w:i w:val="0"/>
-          <w:sz w:val="22"/>
+          <w:sz w:val="21"/>
         </w:rPr>
-        <w:t>Python, SQL, AWS (S3, Redshift, DynamoDB, CloudWatch), Flask, VBA, ETL Pipeline Development, Risk Detection &amp; Sampling Logic, Audit Automation, Data Analysis &amp; Visualization, QuickSight Dashboarding, SAP, Excel, Workflow Optimization, Stakeholder Management, Internal Tool Development, AHT Modeling &amp; Bottleneck Analysis</w:t>
+        <w:t>- Trust &amp; Safety Analytics</w:t>
+      </w:r>
+    </w:p>
+    <w:p>
+      <w:pPr>
+        <w:spacing w:before="30" w:after="30" w:line="276" w:lineRule="exact"/>
+        <w:ind w:left="432" w:hanging="288"/>
+      </w:pPr>
+      <w:r>
+        <w:rPr>
+          <w:rFonts w:ascii="Calibri" w:hAnsi="Calibri"/>
+          <w:b w:val="0"/>
+          <w:i w:val="0"/>
+          <w:sz w:val="21"/>
+        </w:rPr>
+        <w:t>- Integrity &amp; Enforcement Quality</w:t>
+      </w:r>
+    </w:p>
+    <w:p>
+      <w:pPr>
+        <w:spacing w:before="30" w:after="30" w:line="276" w:lineRule="exact"/>
+        <w:ind w:left="432" w:hanging="288"/>
+      </w:pPr>
+      <w:r>
+        <w:rPr>
+          <w:rFonts w:ascii="Calibri" w:hAnsi="Calibri"/>
+          <w:b w:val="0"/>
+          <w:i w:val="0"/>
+          <w:sz w:val="21"/>
+        </w:rPr>
+        <w:t>- Risk Detection</w:t>
+      </w:r>
+    </w:p>
+    <w:p>
+      <w:pPr>
+        <w:spacing w:before="30" w:after="30" w:line="276" w:lineRule="exact"/>
+        <w:ind w:left="432" w:hanging="288"/>
+      </w:pPr>
+      <w:r>
+        <w:rPr>
+          <w:rFonts w:ascii="Calibri" w:hAnsi="Calibri"/>
+          <w:b w:val="0"/>
+          <w:i w:val="0"/>
+          <w:sz w:val="21"/>
+        </w:rPr>
+        <w:t>- Audit Design</w:t>
+      </w:r>
+    </w:p>
+    <w:p>
+      <w:pPr>
+        <w:spacing w:before="30" w:after="30" w:line="276" w:lineRule="exact"/>
+        <w:ind w:left="432" w:hanging="288"/>
+      </w:pPr>
+      <w:r>
+        <w:rPr>
+          <w:rFonts w:ascii="Calibri" w:hAnsi="Calibri"/>
+          <w:b w:val="0"/>
+          <w:i w:val="0"/>
+          <w:sz w:val="21"/>
+        </w:rPr>
+        <w:t>- Compliance Validation</w:t>
+      </w:r>
+    </w:p>
+    <w:p>
+      <w:pPr>
+        <w:spacing w:before="30" w:after="30" w:line="276" w:lineRule="exact"/>
+        <w:ind w:left="432" w:hanging="288"/>
+      </w:pPr>
+      <w:r>
+        <w:rPr>
+          <w:rFonts w:ascii="Calibri" w:hAnsi="Calibri"/>
+          <w:b w:val="0"/>
+          <w:i w:val="0"/>
+          <w:sz w:val="21"/>
+        </w:rPr>
+        <w:t>- SQL (Advanced)</w:t>
+      </w:r>
+    </w:p>
+    <w:p>
+      <w:pPr>
+        <w:spacing w:before="30" w:after="30" w:line="276" w:lineRule="exact"/>
+        <w:ind w:left="432" w:hanging="288"/>
+      </w:pPr>
+      <w:r>
+        <w:rPr>
+          <w:rFonts w:ascii="Calibri" w:hAnsi="Calibri"/>
+          <w:b w:val="0"/>
+          <w:i w:val="0"/>
+          <w:sz w:val="21"/>
+        </w:rPr>
+        <w:t>- Amazon Redshift</w:t>
+      </w:r>
+    </w:p>
+    <w:p>
+      <w:pPr>
+        <w:spacing w:before="30" w:after="30" w:line="276" w:lineRule="exact"/>
+        <w:ind w:left="432" w:hanging="288"/>
+      </w:pPr>
+      <w:r>
+        <w:rPr>
+          <w:rFonts w:ascii="Calibri" w:hAnsi="Calibri"/>
+          <w:b w:val="0"/>
+          <w:i w:val="0"/>
+          <w:sz w:val="21"/>
+        </w:rPr>
+        <w:t>- Large-Scale Data Analysis</w:t>
+      </w:r>
+    </w:p>
+    <w:p>
+      <w:pPr>
+        <w:spacing w:before="30" w:after="30" w:line="276" w:lineRule="exact"/>
+        <w:ind w:left="432" w:hanging="288"/>
+      </w:pPr>
+      <w:r>
+        <w:rPr>
+          <w:rFonts w:ascii="Calibri" w:hAnsi="Calibri"/>
+          <w:b w:val="0"/>
+          <w:i w:val="0"/>
+          <w:sz w:val="21"/>
+        </w:rPr>
+        <w:t>- Python Automation</w:t>
+      </w:r>
+    </w:p>
+    <w:p>
+      <w:pPr>
+        <w:spacing w:before="30" w:after="30" w:line="276" w:lineRule="exact"/>
+        <w:ind w:left="432" w:hanging="288"/>
+      </w:pPr>
+      <w:r>
+        <w:rPr>
+          <w:rFonts w:ascii="Calibri" w:hAnsi="Calibri"/>
+          <w:b w:val="0"/>
+          <w:i w:val="0"/>
+          <w:sz w:val="21"/>
+        </w:rPr>
+        <w:t>- Agent-Based Systems</w:t>
+      </w:r>
+    </w:p>
+    <w:p>
+      <w:pPr>
+        <w:spacing w:before="30" w:after="30" w:line="276" w:lineRule="exact"/>
+        <w:ind w:left="432" w:hanging="288"/>
+      </w:pPr>
+      <w:r>
+        <w:rPr>
+          <w:rFonts w:ascii="Calibri" w:hAnsi="Calibri"/>
+          <w:b w:val="0"/>
+          <w:i w:val="0"/>
+          <w:sz w:val="21"/>
+        </w:rPr>
+        <w:t>- Root Cause Analysis</w:t>
+      </w:r>
+    </w:p>
+    <w:p>
+      <w:pPr>
+        <w:spacing w:before="30" w:after="30" w:line="276" w:lineRule="exact"/>
+        <w:ind w:left="432" w:hanging="288"/>
+      </w:pPr>
+      <w:r>
+        <w:rPr>
+          <w:rFonts w:ascii="Calibri" w:hAnsi="Calibri"/>
+          <w:b w:val="0"/>
+          <w:i w:val="0"/>
+          <w:sz w:val="21"/>
+        </w:rPr>
+        <w:t>- Stakeholder Decision Support</w:t>
+      </w:r>
+    </w:p>
+    <w:p>
+      <w:pPr>
+        <w:spacing w:before="30" w:after="30" w:line="276" w:lineRule="exact"/>
+        <w:ind w:left="432" w:hanging="288"/>
+      </w:pPr>
+      <w:r>
+        <w:rPr>
+          <w:rFonts w:ascii="Calibri" w:hAnsi="Calibri"/>
+          <w:b w:val="0"/>
+          <w:i w:val="0"/>
+          <w:sz w:val="21"/>
+        </w:rPr>
+        <w:t>- VBA</w:t>
+      </w:r>
+    </w:p>
+    <w:p>
+      <w:pPr>
+        <w:spacing w:before="30" w:after="30" w:line="276" w:lineRule="exact"/>
+        <w:ind w:left="432" w:hanging="288"/>
+      </w:pPr>
+      <w:r>
+        <w:rPr>
+          <w:rFonts w:ascii="Calibri" w:hAnsi="Calibri"/>
+          <w:b w:val="0"/>
+          <w:i w:val="0"/>
+          <w:sz w:val="21"/>
+        </w:rPr>
+        <w:t>- Excel</w:t>
+      </w:r>
+    </w:p>
+    <w:p>
+      <w:pPr>
+        <w:spacing w:before="30" w:after="30" w:line="276" w:lineRule="exact"/>
+        <w:ind w:left="432" w:hanging="288"/>
+      </w:pPr>
+      <w:r>
+        <w:rPr>
+          <w:rFonts w:ascii="Calibri" w:hAnsi="Calibri"/>
+          <w:b w:val="0"/>
+          <w:i w:val="0"/>
+          <w:sz w:val="21"/>
+        </w:rPr>
+        <w:t>- AWS</w:t>
+      </w:r>
+    </w:p>
+    <w:p>
+      <w:pPr>
+        <w:spacing w:before="30" w:after="30" w:line="276" w:lineRule="exact"/>
+        <w:ind w:left="432" w:hanging="288"/>
+      </w:pPr>
+      <w:r>
+        <w:rPr>
+          <w:rFonts w:ascii="Calibri" w:hAnsi="Calibri"/>
+          <w:b w:val="0"/>
+          <w:i w:val="0"/>
+          <w:sz w:val="21"/>
+        </w:rPr>
+        <w:t>- ETL</w:t>
+      </w:r>
+    </w:p>
+    <w:p>
+      <w:pPr>
+        <w:spacing w:before="30" w:after="30" w:line="276" w:lineRule="exact"/>
+        <w:ind w:left="432" w:hanging="288"/>
+      </w:pPr>
+      <w:r>
+        <w:rPr>
+          <w:rFonts w:ascii="Calibri" w:hAnsi="Calibri"/>
+          <w:b w:val="0"/>
+          <w:i w:val="0"/>
+          <w:sz w:val="21"/>
+        </w:rPr>
+        <w:t>- Dashboarding &amp; Self-Serve Analytics (Amazon QuickSight)</w:t>
       </w:r>
     </w:p>
     <w:p>
@@ -141,7 +366,7 @@
           <w:color w:val="2B2B5E"/>
           <w:sz w:val="24"/>
         </w:rPr>
-        <w:t>PROFESSIONAL EXPERIENCE</w:t>
+        <w:t>WORK EXPERIENCE</w:t>
       </w:r>
     </w:p>
     <w:p>
@@ -163,29 +388,19 @@
           <w:rFonts w:ascii="Calibri" w:hAnsi="Calibri"/>
           <w:b/>
           <w:i w:val="0"/>
-          <w:color w:val="2B2B5E"/>
           <w:sz w:val="22"/>
         </w:rPr>
-        <w:t>Business Analyst</w:t>
+        <w:t>Amazon Prime Video Trust and Safety</w:t>
       </w:r>
       <w:r>
         <w:rPr>
           <w:rFonts w:ascii="Calibri" w:hAnsi="Calibri"/>
           <w:b w:val="0"/>
-          <w:i w:val="0"/>
-          <w:color w:val="787878"/>
-          <w:sz w:val="22"/>
+          <w:i/>
+          <w:color w:val="646464"/>
+          <w:sz w:val="20"/>
         </w:rPr>
-        <w:t xml:space="preserve">  |  </w:t>
-      </w:r>
-      <w:r>
-        <w:rPr>
-          <w:rFonts w:ascii="Calibri" w:hAnsi="Calibri"/>
-          <w:b/>
-          <w:i w:val="0"/>
-          <w:sz w:val="22"/>
-        </w:rPr>
-        <w:t>Amazon Prime Video and Studios</w:t>
+        <w:t xml:space="preserve">  -  Bengaluru, India</w:t>
       </w:r>
     </w:p>
     <w:p>
@@ -196,17 +411,53 @@
       <w:r>
         <w:rPr>
           <w:rFonts w:ascii="Calibri" w:hAnsi="Calibri"/>
+          <w:b/>
+          <w:i w:val="0"/>
+          <w:color w:val="2B2B5E"/>
+          <w:sz w:val="22"/>
+        </w:rPr>
+        <w:t>Trust and Safety Quality Analyst</w:t>
+      </w:r>
+      <w:r>
+        <w:rPr>
+          <w:rFonts w:ascii="Calibri" w:hAnsi="Calibri"/>
+          <w:b w:val="0"/>
+          <w:i w:val="0"/>
+          <w:color w:val="969696"/>
+          <w:sz w:val="20"/>
+        </w:rPr>
+        <w:t xml:space="preserve">  |  </w:t>
+      </w:r>
+      <w:r>
+        <w:rPr>
+          <w:rFonts w:ascii="Calibri" w:hAnsi="Calibri"/>
           <w:b w:val="0"/>
           <w:i/>
           <w:color w:val="646464"/>
           <w:sz w:val="20"/>
         </w:rPr>
-        <w:t>May 2022 Present  |  Bangalore</w:t>
+        <w:t>June 2022 - Present</w:t>
       </w:r>
     </w:p>
     <w:p>
       <w:pPr>
-        <w:spacing w:before="40" w:after="40" w:line="276" w:lineRule="exact"/>
+        <w:spacing w:before="100" w:after="40"/>
+        <w:keepNext/>
+      </w:pPr>
+      <w:r>
+        <w:rPr>
+          <w:rFonts w:ascii="Calibri" w:hAnsi="Calibri"/>
+          <w:b/>
+          <w:i/>
+          <w:color w:val="444444"/>
+          <w:sz w:val="21"/>
+        </w:rPr>
+        <w:t>Risk Detection, Audit Intelligence &amp; Enforcement Quality</w:t>
+      </w:r>
+    </w:p>
+    <w:p>
+      <w:pPr>
+        <w:spacing w:before="30" w:after="30" w:line="276" w:lineRule="exact"/>
         <w:ind w:left="432" w:hanging="288"/>
       </w:pPr>
       <w:r>
@@ -214,14 +465,14 @@
           <w:rFonts w:ascii="Calibri" w:hAnsi="Calibri"/>
           <w:b w:val="0"/>
           <w:i w:val="0"/>
-          <w:sz w:val="22"/>
+          <w:sz w:val="21"/>
         </w:rPr>
-        <w:t>- Architected and deployed full-stack audit orchestration platform using Python, Flask, DynamoDB, and Redshift, now used by 200+ employees globally, saving 18 analyst-hours per day and reducing manual touchpoints from 30+ to 3.</w:t>
+        <w:t>- Redesigned quality sampling and enforcement validation logic across 11 workflows, increasing detection of critical defects by 30% and strengthening audit confidence in high-volume review pipelines.</w:t>
       </w:r>
     </w:p>
     <w:p>
       <w:pPr>
-        <w:spacing w:before="40" w:after="40" w:line="276" w:lineRule="exact"/>
+        <w:spacing w:before="30" w:after="30" w:line="276" w:lineRule="exact"/>
         <w:ind w:left="432" w:hanging="288"/>
       </w:pPr>
       <w:r>
@@ -229,14 +480,14 @@
           <w:rFonts w:ascii="Calibri" w:hAnsi="Calibri"/>
           <w:b w:val="0"/>
           <w:i w:val="0"/>
-          <w:sz w:val="22"/>
+          <w:sz w:val="21"/>
         </w:rPr>
-        <w:t>- Engineered Python-based agent automation system for storefront compliance audits, integrating playback simulation, screenshot capture, and Cloud OCR processing with automated pass/fail detection logic.</w:t>
+        <w:t>- Conducted deep root-cause analyses on false-positive and false-negative enforcement signals, directly improving sampling accuracy and decision reliability.</w:t>
       </w:r>
     </w:p>
     <w:p>
       <w:pPr>
-        <w:spacing w:before="40" w:after="40" w:line="276" w:lineRule="exact"/>
+        <w:spacing w:before="30" w:after="30" w:line="276" w:lineRule="exact"/>
         <w:ind w:left="432" w:hanging="288"/>
       </w:pPr>
       <w:r>
@@ -244,14 +495,30 @@
           <w:rFonts w:ascii="Calibri" w:hAnsi="Calibri"/>
           <w:b w:val="0"/>
           <w:i w:val="0"/>
-          <w:sz w:val="22"/>
+          <w:sz w:val="21"/>
         </w:rPr>
-        <w:t>- Redesigned SQL-based defect detection thresholds through historical pattern analysis, achieving 30% improvement in critical issue detection while reducing false positives in enforcement pipelines.</w:t>
+        <w:t>- Supported regulatory and compliance data requests across 3 global teams, ensuring accurate, traceable evidence under strict governance requirements.</w:t>
       </w:r>
     </w:p>
     <w:p>
       <w:pPr>
-        <w:spacing w:before="40" w:after="40" w:line="276" w:lineRule="exact"/>
+        <w:spacing w:before="100" w:after="40"/>
+        <w:keepNext/>
+      </w:pPr>
+      <w:r>
+        <w:rPr>
+          <w:rFonts w:ascii="Calibri" w:hAnsi="Calibri"/>
+          <w:b/>
+          <w:i/>
+          <w:color w:val="444444"/>
+          <w:sz w:val="21"/>
+        </w:rPr>
+        <w:t>Agent-Based Automation &amp; Compliance Systems</w:t>
+      </w:r>
+    </w:p>
+    <w:p>
+      <w:pPr>
+        <w:spacing w:before="30" w:after="30" w:line="276" w:lineRule="exact"/>
         <w:ind w:left="432" w:hanging="288"/>
       </w:pPr>
       <w:r>
@@ -259,14 +526,14 @@
           <w:rFonts w:ascii="Calibri" w:hAnsi="Calibri"/>
           <w:b w:val="0"/>
           <w:i w:val="0"/>
-          <w:sz w:val="22"/>
+          <w:sz w:val="21"/>
         </w:rPr>
-        <w:t>- Conducted deep-dive analysis on defect data across workflows, identifying recurring risk patterns and developing targeted risk-based sampling logic to surface erroneous items from large data pools.</w:t>
+        <w:t>- Designed and built an end-to-end agent-based automation system to replace manual Walk the Store compliance audits on the Prime Video storefront.</w:t>
       </w:r>
     </w:p>
     <w:p>
       <w:pPr>
-        <w:spacing w:before="40" w:after="40" w:line="276" w:lineRule="exact"/>
+        <w:spacing w:before="30" w:after="30" w:line="276" w:lineRule="exact"/>
         <w:ind w:left="432" w:hanging="288"/>
       </w:pPr>
       <w:r>
@@ -274,14 +541,14 @@
           <w:rFonts w:ascii="Calibri" w:hAnsi="Calibri"/>
           <w:b w:val="0"/>
           <w:i w:val="0"/>
-          <w:sz w:val="22"/>
+          <w:sz w:val="21"/>
         </w:rPr>
-        <w:t>- Built ETL pipelines to ingest and process audited data daily, creating a self-adjusting risk detection system with continuous feedback loop between audit outcomes and detection thresholds.</w:t>
+        <w:t>- Automated storefront navigation, title discovery, and playback simulation to detect on-screen maturity rating and content descriptor (MRN/CD) overlays in real time.</w:t>
       </w:r>
     </w:p>
     <w:p>
       <w:pPr>
-        <w:spacing w:before="40" w:after="40" w:line="276" w:lineRule="exact"/>
+        <w:spacing w:before="30" w:after="30" w:line="276" w:lineRule="exact"/>
         <w:ind w:left="432" w:hanging="288"/>
       </w:pPr>
       <w:r>
@@ -289,14 +556,14 @@
           <w:rFonts w:ascii="Calibri" w:hAnsi="Calibri"/>
           <w:b w:val="0"/>
           <w:i w:val="0"/>
-          <w:sz w:val="22"/>
+          <w:sz w:val="21"/>
         </w:rPr>
-        <w:t>- Designed and maintained standardized pipeline for model outputs per organizational requirements, owning critical datasets consumed by multiple analytical teams.</w:t>
+        <w:t>- Implemented screenshot capture and cloud-based processing to convert visual compliance signals into structured text evidence.</w:t>
       </w:r>
     </w:p>
     <w:p>
       <w:pPr>
-        <w:spacing w:before="40" w:after="40" w:line="276" w:lineRule="exact"/>
+        <w:spacing w:before="30" w:after="30" w:line="276" w:lineRule="exact"/>
         <w:ind w:left="432" w:hanging="288"/>
       </w:pPr>
       <w:r>
@@ -304,14 +571,14 @@
           <w:rFonts w:ascii="Calibri" w:hAnsi="Calibri"/>
           <w:b w:val="0"/>
           <w:i w:val="0"/>
-          <w:sz w:val="22"/>
+          <w:sz w:val="21"/>
         </w:rPr>
-        <w:t>- Resolved 100+ ad-hoc data requests from cross-functional stakeholders, delivering custom SQL queries, data extracts, and analytical summaries under tight deadlines.</w:t>
+        <w:t>- Cross-validated extracted MRN/CD signals against internal audit systems to automatically determine pass/fail outcomes.</w:t>
       </w:r>
     </w:p>
     <w:p>
       <w:pPr>
-        <w:spacing w:before="40" w:after="40" w:line="276" w:lineRule="exact"/>
+        <w:spacing w:before="30" w:after="30" w:line="276" w:lineRule="exact"/>
         <w:ind w:left="432" w:hanging="288"/>
       </w:pPr>
       <w:r>
@@ -319,14 +586,14 @@
           <w:rFonts w:ascii="Calibri" w:hAnsi="Calibri"/>
           <w:b w:val="0"/>
           <w:i w:val="0"/>
-          <w:sz w:val="22"/>
+          <w:sz w:val="21"/>
         </w:rPr>
-        <w:t>- Developed dynamic Time and Motion Study engine with step-wise time capture, automatic AHT calculation, bottleneck discovery, and optimal vs achievable target modeling.</w:t>
+        <w:t>- Flagged mismatches, missing signals, and incorrect ratings for targeted root-cause investigation, eliminating repetitive manual reviews and improving detection reliability.</w:t>
       </w:r>
     </w:p>
     <w:p>
       <w:pPr>
-        <w:spacing w:before="40" w:after="40" w:line="276" w:lineRule="exact"/>
+        <w:spacing w:before="30" w:after="30" w:line="276" w:lineRule="exact"/>
         <w:ind w:left="432" w:hanging="288"/>
       </w:pPr>
       <w:r>
@@ -334,14 +601,30 @@
           <w:rFonts w:ascii="Calibri" w:hAnsi="Calibri"/>
           <w:b w:val="0"/>
           <w:i w:val="0"/>
-          <w:sz w:val="22"/>
+          <w:sz w:val="21"/>
         </w:rPr>
-        <w:t>- Developed 3 VBA macros deployed as BAU tools across 50+ employees, saving approximately 10 hours per week and achieving 80% manual touchpoint reduction in audit workflows.</w:t>
+        <w:t>- Enabled auditors to focus on exception analysis and enforcement accuracy rather than routine navigation tasks.</w:t>
       </w:r>
     </w:p>
     <w:p>
       <w:pPr>
-        <w:spacing w:before="40" w:after="40" w:line="276" w:lineRule="exact"/>
+        <w:spacing w:before="100" w:after="40"/>
+        <w:keepNext/>
+      </w:pPr>
+      <w:r>
+        <w:rPr>
+          <w:rFonts w:ascii="Calibri" w:hAnsi="Calibri"/>
+          <w:b/>
+          <w:i/>
+          <w:color w:val="444444"/>
+          <w:sz w:val="21"/>
+        </w:rPr>
+        <w:t>Analytics, Decision Support &amp; Stakeholder Influence</w:t>
+      </w:r>
+    </w:p>
+    <w:p>
+      <w:pPr>
+        <w:spacing w:before="30" w:after="30" w:line="276" w:lineRule="exact"/>
         <w:ind w:left="432" w:hanging="288"/>
       </w:pPr>
       <w:r>
@@ -349,14 +632,130 @@
           <w:rFonts w:ascii="Calibri" w:hAnsi="Calibri"/>
           <w:b w:val="0"/>
           <w:i w:val="0"/>
-          <w:sz w:val="22"/>
+          <w:sz w:val="21"/>
         </w:rPr>
-        <w:t>- Built live admin dashboards using QuickSight, enabling self-serve workflow visibility and tracking volumes, quality, and SLA trends for leadership reviews.</w:t>
+        <w:t>- Built centralized, self-serve quality dashboards used by 20+ managers, reducing reporting overhead and enabling faster risk-based decision-making.</w:t>
+      </w:r>
+    </w:p>
+    <w:p>
+      <w:pPr>
+        <w:spacing w:before="30" w:after="30" w:line="276" w:lineRule="exact"/>
+        <w:ind w:left="432" w:hanging="288"/>
+      </w:pPr>
+      <w:r>
+        <w:rPr>
+          <w:rFonts w:ascii="Calibri" w:hAnsi="Calibri"/>
+          <w:b w:val="0"/>
+          <w:i w:val="0"/>
+          <w:sz w:val="21"/>
+        </w:rPr>
+        <w:t>- Partnered with global stakeholders to explain enforcement anomalies, performance trends, and audit outcomes using data-backed narratives.</w:t>
+      </w:r>
+    </w:p>
+    <w:p>
+      <w:pPr>
+        <w:spacing w:before="30" w:after="30" w:line="276" w:lineRule="exact"/>
+        <w:ind w:left="432" w:hanging="288"/>
+      </w:pPr>
+      <w:r>
+        <w:rPr>
+          <w:rFonts w:ascii="Calibri" w:hAnsi="Calibri"/>
+          <w:b w:val="0"/>
+          <w:i w:val="0"/>
+          <w:sz w:val="21"/>
+        </w:rPr>
+        <w:t>- Translated complex SQL analyses into executive-ready insights influencing prioritization of quality and integrity initiatives.</w:t>
+      </w:r>
+    </w:p>
+    <w:p>
+      <w:pPr>
+        <w:spacing w:before="100" w:after="40"/>
+        <w:keepNext/>
+      </w:pPr>
+      <w:r>
+        <w:rPr>
+          <w:rFonts w:ascii="Calibri" w:hAnsi="Calibri"/>
+          <w:b/>
+          <w:i/>
+          <w:color w:val="444444"/>
+          <w:sz w:val="21"/>
+        </w:rPr>
+        <w:t>Automation &amp; Scalable Intelligence</w:t>
+      </w:r>
+    </w:p>
+    <w:p>
+      <w:pPr>
+        <w:spacing w:before="30" w:after="30" w:line="276" w:lineRule="exact"/>
+        <w:ind w:left="432" w:hanging="288"/>
+      </w:pPr>
+      <w:r>
+        <w:rPr>
+          <w:rFonts w:ascii="Calibri" w:hAnsi="Calibri"/>
+          <w:b w:val="0"/>
+          <w:i w:val="0"/>
+          <w:sz w:val="21"/>
+        </w:rPr>
+        <w:t>- Developed Python-based analytics and monitoring tools used by 300+ employees, improving real-time visibility into data health and operational risks.</w:t>
+      </w:r>
+    </w:p>
+    <w:p>
+      <w:pPr>
+        <w:spacing w:before="30" w:after="30" w:line="276" w:lineRule="exact"/>
+        <w:ind w:left="432" w:hanging="288"/>
+      </w:pPr>
+      <w:r>
+        <w:rPr>
+          <w:rFonts w:ascii="Calibri" w:hAnsi="Calibri"/>
+          <w:b w:val="0"/>
+          <w:i w:val="0"/>
+          <w:sz w:val="21"/>
+        </w:rPr>
+        <w:t>- Automated detection of pipeline failures and data inconsistencies, saving approximately 2 analyst-hours daily and improving responsiveness.</w:t>
+      </w:r>
+    </w:p>
+    <w:p>
+      <w:pPr>
+        <w:spacing w:before="30" w:after="30" w:line="276" w:lineRule="exact"/>
+        <w:ind w:left="432" w:hanging="288"/>
+      </w:pPr>
+      <w:r>
+        <w:rPr>
+          <w:rFonts w:ascii="Calibri" w:hAnsi="Calibri"/>
+          <w:b w:val="0"/>
+          <w:i w:val="0"/>
+          <w:sz w:val="21"/>
+        </w:rPr>
+        <w:t>- Prototyped LLM-powered analytical tooling to generate Weekly Business Review insights directly from source tables, reducing dashboard dependency and accelerating leadership consumption of insights.</w:t>
       </w:r>
     </w:p>
     <w:p>
       <w:pPr>
         <w:spacing w:before="160" w:after="0"/>
+        <w:keepNext/>
+      </w:pPr>
+      <w:r>
+        <w:rPr>
+          <w:rFonts w:ascii="Calibri" w:hAnsi="Calibri"/>
+          <w:b/>
+          <w:i w:val="0"/>
+          <w:sz w:val="22"/>
+        </w:rPr>
+        <w:t>Amazon Prime Video Trust and Safety</w:t>
+      </w:r>
+      <w:r>
+        <w:rPr>
+          <w:rFonts w:ascii="Calibri" w:hAnsi="Calibri"/>
+          <w:b w:val="0"/>
+          <w:i/>
+          <w:color w:val="646464"/>
+          <w:sz w:val="20"/>
+        </w:rPr>
+        <w:t xml:space="preserve">  -  Bengaluru, India</w:t>
+      </w:r>
+    </w:p>
+    <w:p>
+      <w:pPr>
+        <w:spacing w:before="20" w:after="60"/>
         <w:keepNext/>
       </w:pPr>
       <w:r>
@@ -374,26 +773,11 @@
           <w:rFonts w:ascii="Calibri" w:hAnsi="Calibri"/>
           <w:b w:val="0"/>
           <w:i w:val="0"/>
-          <w:color w:val="787878"/>
-          <w:sz w:val="22"/>
+          <w:color w:val="969696"/>
+          <w:sz w:val="20"/>
         </w:rPr>
         <w:t xml:space="preserve">  |  </w:t>
       </w:r>
-      <w:r>
-        <w:rPr>
-          <w:rFonts w:ascii="Calibri" w:hAnsi="Calibri"/>
-          <w:b/>
-          <w:i w:val="0"/>
-          <w:sz w:val="22"/>
-        </w:rPr>
-        <w:t>Amazon Prime Video and Studios</w:t>
-      </w:r>
-    </w:p>
-    <w:p>
-      <w:pPr>
-        <w:spacing w:before="20" w:after="60"/>
-        <w:keepNext/>
-      </w:pPr>
       <w:r>
         <w:rPr>
           <w:rFonts w:ascii="Calibri" w:hAnsi="Calibri"/>
@@ -402,12 +786,12 @@
           <w:color w:val="646464"/>
           <w:sz w:val="20"/>
         </w:rPr>
-        <w:t>March 2022 May 2022  |  Bangalore</w:t>
+        <w:t>March 2022 - May 2022</w:t>
       </w:r>
     </w:p>
     <w:p>
       <w:pPr>
-        <w:spacing w:before="40" w:after="40" w:line="276" w:lineRule="exact"/>
+        <w:spacing w:before="30" w:after="30" w:line="276" w:lineRule="exact"/>
         <w:ind w:left="432" w:hanging="288"/>
       </w:pPr>
       <w:r>
@@ -415,14 +799,14 @@
           <w:rFonts w:ascii="Calibri" w:hAnsi="Calibri"/>
           <w:b w:val="0"/>
           <w:i w:val="0"/>
-          <w:sz w:val="22"/>
+          <w:sz w:val="21"/>
         </w:rPr>
-        <w:t>- Conducted content analysis and classification with 98% productivity while maintaining 100% quality standards.</w:t>
+        <w:t>- Conducted content analysis and classification with 98% productivity keeping 100% quality.</w:t>
       </w:r>
     </w:p>
     <w:p>
       <w:pPr>
-        <w:spacing w:before="40" w:after="40" w:line="276" w:lineRule="exact"/>
+        <w:spacing w:before="30" w:after="30" w:line="276" w:lineRule="exact"/>
         <w:ind w:left="432" w:hanging="288"/>
       </w:pPr>
       <w:r>
@@ -430,14 +814,14 @@
           <w:rFonts w:ascii="Calibri" w:hAnsi="Calibri"/>
           <w:b w:val="0"/>
           <w:i w:val="0"/>
-          <w:sz w:val="22"/>
+          <w:sz w:val="21"/>
         </w:rPr>
         <w:t>- Managed sensitive corporate data in secure environment with strict governance protocols.</w:t>
       </w:r>
     </w:p>
     <w:p>
       <w:pPr>
-        <w:spacing w:before="40" w:after="40" w:line="276" w:lineRule="exact"/>
+        <w:spacing w:before="30" w:after="30" w:line="276" w:lineRule="exact"/>
         <w:ind w:left="432" w:hanging="288"/>
       </w:pPr>
       <w:r>
@@ -445,7 +829,7 @@
           <w:rFonts w:ascii="Calibri" w:hAnsi="Calibri"/>
           <w:b w:val="0"/>
           <w:i w:val="0"/>
-          <w:sz w:val="22"/>
+          <w:sz w:val="21"/>
         </w:rPr>
         <w:t>- Collaborated with 40+ team members on data collection, validation, and weekly reporting.</w:t>
       </w:r>
@@ -453,6 +837,31 @@
     <w:p>
       <w:pPr>
         <w:spacing w:before="160" w:after="0"/>
+        <w:keepNext/>
+      </w:pPr>
+      <w:r>
+        <w:rPr>
+          <w:rFonts w:ascii="Calibri" w:hAnsi="Calibri"/>
+          <w:b/>
+          <w:i w:val="0"/>
+          <w:sz w:val="22"/>
+        </w:rPr>
+        <w:t>MRF</w:t>
+      </w:r>
+      <w:r>
+        <w:rPr>
+          <w:rFonts w:ascii="Calibri" w:hAnsi="Calibri"/>
+          <w:b w:val="0"/>
+          <w:i/>
+          <w:color w:val="646464"/>
+          <w:sz w:val="20"/>
+        </w:rPr>
+        <w:t xml:space="preserve">  -  Agra, Uttar Pradesh</w:t>
+      </w:r>
+    </w:p>
+    <w:p>
+      <w:pPr>
+        <w:spacing w:before="20" w:after="60"/>
         <w:keepNext/>
       </w:pPr>
       <w:r>
@@ -470,26 +879,11 @@
           <w:rFonts w:ascii="Calibri" w:hAnsi="Calibri"/>
           <w:b w:val="0"/>
           <w:i w:val="0"/>
-          <w:color w:val="787878"/>
-          <w:sz w:val="22"/>
+          <w:color w:val="969696"/>
+          <w:sz w:val="20"/>
         </w:rPr>
         <w:t xml:space="preserve">  |  </w:t>
       </w:r>
-      <w:r>
-        <w:rPr>
-          <w:rFonts w:ascii="Calibri" w:hAnsi="Calibri"/>
-          <w:b/>
-          <w:i w:val="0"/>
-          <w:sz w:val="22"/>
-        </w:rPr>
-        <w:t>MRF Limited</w:t>
-      </w:r>
-    </w:p>
-    <w:p>
-      <w:pPr>
-        <w:spacing w:before="20" w:after="60"/>
-        <w:keepNext/>
-      </w:pPr>
       <w:r>
         <w:rPr>
           <w:rFonts w:ascii="Calibri" w:hAnsi="Calibri"/>
@@ -498,12 +892,12 @@
           <w:color w:val="646464"/>
           <w:sz w:val="20"/>
         </w:rPr>
-        <w:t>January 2021 March 2022  |  Agra</w:t>
+        <w:t>January 2021 - March 2022</w:t>
       </w:r>
     </w:p>
     <w:p>
       <w:pPr>
-        <w:spacing w:before="40" w:after="40" w:line="276" w:lineRule="exact"/>
+        <w:spacing w:before="30" w:after="30" w:line="276" w:lineRule="exact"/>
         <w:ind w:left="432" w:hanging="288"/>
       </w:pPr>
       <w:r>
@@ -511,14 +905,14 @@
           <w:rFonts w:ascii="Calibri" w:hAnsi="Calibri"/>
           <w:b w:val="0"/>
           <w:i w:val="0"/>
-          <w:sz w:val="22"/>
+          <w:sz w:val="21"/>
         </w:rPr>
-        <w:t>- Generated daily Management Information Reports by compiling and analyzing large datasets for senior management decision-making.</w:t>
+        <w:t>- Produced daily MIS reports for senior leadership by analyzing operational, inventory, and sales datasets.</w:t>
       </w:r>
     </w:p>
     <w:p>
       <w:pPr>
-        <w:spacing w:before="40" w:after="40" w:line="276" w:lineRule="exact"/>
+        <w:spacing w:before="30" w:after="30" w:line="276" w:lineRule="exact"/>
         <w:ind w:left="432" w:hanging="288"/>
       </w:pPr>
       <w:r>
@@ -526,14 +920,14 @@
           <w:rFonts w:ascii="Calibri" w:hAnsi="Calibri"/>
           <w:b w:val="0"/>
           <w:i w:val="0"/>
-          <w:sz w:val="22"/>
+          <w:sz w:val="21"/>
         </w:rPr>
-        <w:t>- Managed SAP-based operations including vendor liabilities, inventory tracking, sales analysis, and inter-office stock transfers.</w:t>
+        <w:t>- Managed SAP-based operations including vendor liabilities, inventory reconciliation, and stock transfer analysis.</w:t>
       </w:r>
     </w:p>
     <w:p>
       <w:pPr>
-        <w:spacing w:before="40" w:after="40" w:line="276" w:lineRule="exact"/>
+        <w:spacing w:before="30" w:after="30" w:line="276" w:lineRule="exact"/>
         <w:ind w:left="432" w:hanging="288"/>
       </w:pPr>
       <w:r>
@@ -541,9 +935,214 @@
           <w:rFonts w:ascii="Calibri" w:hAnsi="Calibri"/>
           <w:b w:val="0"/>
           <w:i w:val="0"/>
+          <w:sz w:val="21"/>
+        </w:rPr>
+        <w:t>- Prepared statutory TDS and TCS returns, ensuring audit readiness and regulatory compliances.</w:t>
+      </w:r>
+    </w:p>
+    <w:p>
+      <w:pPr>
+        <w:spacing w:before="200" w:after="0"/>
+        <w:keepNext/>
+      </w:pPr>
+      <w:r>
+        <w:rPr>
+          <w:rFonts w:ascii="Calibri" w:hAnsi="Calibri"/>
+          <w:b/>
+          <w:i w:val="0"/>
+          <w:color w:val="2B2B5E"/>
+          <w:sz w:val="24"/>
+        </w:rPr>
+        <w:t>KEY PROJECTS</w:t>
+      </w:r>
+    </w:p>
+    <w:p>
+      <w:pPr>
+        <w:spacing w:before="20" w:after="80"/>
+        <w:pBdr>
+          <w:bottom w:val="single" w:sz="4" w:space="1" w:color="2B2B5E"/>
+        </w:pBdr>
+        <w:keepNext/>
+      </w:pPr>
+    </w:p>
+    <w:p>
+      <w:pPr>
+        <w:spacing w:before="120" w:after="40"/>
+        <w:keepNext/>
+      </w:pPr>
+      <w:r>
+        <w:rPr>
+          <w:rFonts w:ascii="Calibri" w:hAnsi="Calibri"/>
+          <w:b/>
+          <w:i w:val="0"/>
           <w:sz w:val="22"/>
         </w:rPr>
-        <w:t>- Prepared and led TDS and TCS Returns, ensuring compliance with regulatory requirements.</w:t>
+        <w:t>1. Agent-Based Storefront Compliance Automation</w:t>
+      </w:r>
+    </w:p>
+    <w:p>
+      <w:pPr>
+        <w:spacing w:before="20" w:after="20" w:line="276" w:lineRule="exact"/>
+        <w:ind w:left="288"/>
+      </w:pPr>
+      <w:r>
+        <w:rPr>
+          <w:rFonts w:ascii="Calibri" w:hAnsi="Calibri"/>
+          <w:b/>
+          <w:i w:val="0"/>
+          <w:color w:val="2B2B5E"/>
+          <w:sz w:val="21"/>
+        </w:rPr>
+        <w:t xml:space="preserve">Problem: </w:t>
+      </w:r>
+      <w:r>
+        <w:rPr>
+          <w:rFonts w:ascii="Calibri" w:hAnsi="Calibri"/>
+          <w:b w:val="0"/>
+          <w:i w:val="0"/>
+          <w:sz w:val="21"/>
+        </w:rPr>
+        <w:t>Manual storefront audits were slow, inconsistent, and prone to missed compliance gaps.</w:t>
+      </w:r>
+    </w:p>
+    <w:p>
+      <w:pPr>
+        <w:spacing w:before="20" w:after="20" w:line="276" w:lineRule="exact"/>
+        <w:ind w:left="288"/>
+      </w:pPr>
+      <w:r>
+        <w:rPr>
+          <w:rFonts w:ascii="Calibri" w:hAnsi="Calibri"/>
+          <w:b/>
+          <w:i w:val="0"/>
+          <w:color w:val="2B2B5E"/>
+          <w:sz w:val="21"/>
+        </w:rPr>
+        <w:t xml:space="preserve">Action: </w:t>
+      </w:r>
+      <w:r>
+        <w:rPr>
+          <w:rFonts w:ascii="Calibri" w:hAnsi="Calibri"/>
+          <w:b w:val="0"/>
+          <w:i w:val="0"/>
+          <w:sz w:val="21"/>
+        </w:rPr>
+        <w:t>Built a Python-based agent system to simulate human navigation, detect MR/CD overlays during playback, capture evidence, process it via cloud services, and validate signals against internal audit records.</w:t>
+      </w:r>
+    </w:p>
+    <w:p>
+      <w:pPr>
+        <w:spacing w:before="20" w:after="20" w:line="276" w:lineRule="exact"/>
+        <w:ind w:left="288"/>
+      </w:pPr>
+      <w:r>
+        <w:rPr>
+          <w:rFonts w:ascii="Calibri" w:hAnsi="Calibri"/>
+          <w:b/>
+          <w:i w:val="0"/>
+          <w:color w:val="2B2B5E"/>
+          <w:sz w:val="21"/>
+        </w:rPr>
+        <w:t xml:space="preserve">Impact: </w:t>
+      </w:r>
+      <w:r>
+        <w:rPr>
+          <w:rFonts w:ascii="Calibri" w:hAnsi="Calibri"/>
+          <w:b w:val="0"/>
+          <w:i w:val="0"/>
+          <w:sz w:val="21"/>
+        </w:rPr>
+        <w:t>Eliminated repetitive manual audits, improved reliability of storefront compliance validation, and enabled focused root-cause investigations.</w:t>
+      </w:r>
+    </w:p>
+    <w:p>
+      <w:pPr>
+        <w:spacing w:before="120" w:after="40"/>
+        <w:keepNext/>
+      </w:pPr>
+      <w:r>
+        <w:rPr>
+          <w:rFonts w:ascii="Calibri" w:hAnsi="Calibri"/>
+          <w:b/>
+          <w:i w:val="0"/>
+          <w:sz w:val="22"/>
+        </w:rPr>
+        <w:t>2. Sampling &amp; Enforcement Signal Optimization</w:t>
+      </w:r>
+    </w:p>
+    <w:p>
+      <w:pPr>
+        <w:spacing w:before="20" w:after="20" w:line="276" w:lineRule="exact"/>
+        <w:ind w:left="288"/>
+      </w:pPr>
+      <w:r>
+        <w:rPr>
+          <w:rFonts w:ascii="Calibri" w:hAnsi="Calibri"/>
+          <w:b/>
+          <w:i w:val="0"/>
+          <w:color w:val="2B2B5E"/>
+          <w:sz w:val="21"/>
+        </w:rPr>
+        <w:t xml:space="preserve">Problem: </w:t>
+      </w:r>
+      <w:r>
+        <w:rPr>
+          <w:rFonts w:ascii="Calibri" w:hAnsi="Calibri"/>
+          <w:b w:val="0"/>
+          <w:i w:val="0"/>
+          <w:sz w:val="21"/>
+        </w:rPr>
+        <w:t>Existing sampling logic under-detected high-risk defects.</w:t>
+      </w:r>
+    </w:p>
+    <w:p>
+      <w:pPr>
+        <w:spacing w:before="20" w:after="20" w:line="276" w:lineRule="exact"/>
+        <w:ind w:left="288"/>
+      </w:pPr>
+      <w:r>
+        <w:rPr>
+          <w:rFonts w:ascii="Calibri" w:hAnsi="Calibri"/>
+          <w:b/>
+          <w:i w:val="0"/>
+          <w:color w:val="2B2B5E"/>
+          <w:sz w:val="21"/>
+        </w:rPr>
+        <w:t xml:space="preserve">Action: </w:t>
+      </w:r>
+      <w:r>
+        <w:rPr>
+          <w:rFonts w:ascii="Calibri" w:hAnsi="Calibri"/>
+          <w:b w:val="0"/>
+          <w:i w:val="0"/>
+          <w:sz w:val="21"/>
+        </w:rPr>
+        <w:t>Redesigned SQL-based detection thresholds using historical defect analysis.</w:t>
+      </w:r>
+    </w:p>
+    <w:p>
+      <w:pPr>
+        <w:spacing w:before="20" w:after="20" w:line="276" w:lineRule="exact"/>
+        <w:ind w:left="288"/>
+      </w:pPr>
+      <w:r>
+        <w:rPr>
+          <w:rFonts w:ascii="Calibri" w:hAnsi="Calibri"/>
+          <w:b/>
+          <w:i w:val="0"/>
+          <w:color w:val="2B2B5E"/>
+          <w:sz w:val="21"/>
+        </w:rPr>
+        <w:t xml:space="preserve">Impact: </w:t>
+      </w:r>
+      <w:r>
+        <w:rPr>
+          <w:rFonts w:ascii="Calibri" w:hAnsi="Calibri"/>
+          <w:b w:val="0"/>
+          <w:i w:val="0"/>
+          <w:sz w:val="21"/>
+        </w:rPr>
+        <w:t>Increased critical issue detection by 30%, strengthening enforcement confidence.</w:t>
       </w:r>
     </w:p>
     <w:p>
@@ -573,7 +1172,7 @@
     </w:p>
     <w:p>
       <w:pPr>
-        <w:spacing w:before="120" w:after="40" w:line="276" w:lineRule="exact"/>
+        <w:spacing w:before="100" w:after="40" w:line="276" w:lineRule="exact"/>
         <w:keepLines/>
       </w:pPr>
       <w:r>
@@ -593,7 +1192,7 @@
           <w:color w:val="787878"/>
           <w:sz w:val="22"/>
         </w:rPr>
-        <w:t xml:space="preserve">  |  </w:t>
+        <w:t xml:space="preserve"> - </w:t>
       </w:r>
       <w:r>
         <w:rPr>
@@ -609,8 +1208,18 @@
           <w:rFonts w:ascii="Calibri" w:hAnsi="Calibri"/>
           <w:b w:val="0"/>
           <w:i w:val="0"/>
+          <w:color w:val="505050"/>
+          <w:sz w:val="20"/>
+        </w:rPr>
+        <w:t xml:space="preserve"> (CGPA: 7.1/10)</w:t>
+      </w:r>
+      <w:r>
+        <w:rPr>
+          <w:rFonts w:ascii="Calibri" w:hAnsi="Calibri"/>
+          <w:b w:val="0"/>
+          <w:i w:val="0"/>
           <w:color w:val="787878"/>
-          <w:sz w:val="22"/>
+          <w:sz w:val="20"/>
         </w:rPr>
         <w:t xml:space="preserve">  |  </w:t>
       </w:r>
@@ -620,34 +1229,14 @@
           <w:b w:val="0"/>
           <w:i/>
           <w:color w:val="646464"/>
-          <w:sz w:val="22"/>
+          <w:sz w:val="20"/>
         </w:rPr>
-        <w:t>2016 2019</w:t>
-      </w:r>
-      <w:r>
-        <w:rPr>
-          <w:rFonts w:ascii="Calibri" w:hAnsi="Calibri"/>
-          <w:b w:val="0"/>
-          <w:i w:val="0"/>
-          <w:color w:val="787878"/>
-          <w:sz w:val="22"/>
-        </w:rPr>
-        <w:t xml:space="preserve">  |  </w:t>
-      </w:r>
-      <w:r>
-        <w:rPr>
-          <w:rFonts w:ascii="Calibri" w:hAnsi="Calibri"/>
-          <w:b w:val="0"/>
-          <w:i w:val="0"/>
-          <w:color w:val="505050"/>
-          <w:sz w:val="22"/>
-        </w:rPr>
-        <w:t>CGPA: 7.1/10</w:t>
+        <w:t>2016 - 2019</w:t>
       </w:r>
     </w:p>
     <w:p>
       <w:pPr>
-        <w:spacing w:before="120" w:after="40" w:line="276" w:lineRule="exact"/>
+        <w:spacing w:before="100" w:after="40" w:line="276" w:lineRule="exact"/>
         <w:keepLines/>
       </w:pPr>
       <w:r>
@@ -667,7 +1256,7 @@
           <w:color w:val="787878"/>
           <w:sz w:val="22"/>
         </w:rPr>
-        <w:t xml:space="preserve">  |  </w:t>
+        <w:t xml:space="preserve"> - </w:t>
       </w:r>
       <w:r>
         <w:rPr>
@@ -683,8 +1272,18 @@
           <w:rFonts w:ascii="Calibri" w:hAnsi="Calibri"/>
           <w:b w:val="0"/>
           <w:i w:val="0"/>
+          <w:color w:val="505050"/>
+          <w:sz w:val="20"/>
+        </w:rPr>
+        <w:t xml:space="preserve"> (Grade: A)</w:t>
+      </w:r>
+      <w:r>
+        <w:rPr>
+          <w:rFonts w:ascii="Calibri" w:hAnsi="Calibri"/>
+          <w:b w:val="0"/>
+          <w:i w:val="0"/>
           <w:color w:val="787878"/>
-          <w:sz w:val="22"/>
+          <w:sz w:val="20"/>
         </w:rPr>
         <w:t xml:space="preserve">  |  </w:t>
       </w:r>
@@ -694,34 +1293,14 @@
           <w:b w:val="0"/>
           <w:i/>
           <w:color w:val="646464"/>
-          <w:sz w:val="22"/>
+          <w:sz w:val="20"/>
         </w:rPr>
-        <w:t>2019 2020</w:t>
-      </w:r>
-      <w:r>
-        <w:rPr>
-          <w:rFonts w:ascii="Calibri" w:hAnsi="Calibri"/>
-          <w:b w:val="0"/>
-          <w:i w:val="0"/>
-          <w:color w:val="787878"/>
-          <w:sz w:val="22"/>
-        </w:rPr>
-        <w:t xml:space="preserve">  |  </w:t>
-      </w:r>
-      <w:r>
-        <w:rPr>
-          <w:rFonts w:ascii="Calibri" w:hAnsi="Calibri"/>
-          <w:b w:val="0"/>
-          <w:i w:val="0"/>
-          <w:color w:val="505050"/>
-          <w:sz w:val="22"/>
-        </w:rPr>
-        <w:t>Grade: A</w:t>
+        <w:t>2019 - 2020</w:t>
       </w:r>
     </w:p>
     <w:sectPr>
       <w:pgSz w:w="11909" w:h="16834"/>
-      <w:pgMar w:top="1440" w:right="1440" w:bottom="1440" w:left="1440" w:header="720" w:footer="720" w:gutter="0"/>
+      <w:pgMar w:top="1080" w:right="1224" w:bottom="1080" w:left="1224" w:header="720" w:footer="720" w:gutter="0"/>
       <w:cols w:space="720"/>
       <w:docGrid w:linePitch="360"/>
     </w:sectPr>

</xml_diff>